<commit_message>
Add rotating mission rewards
</commit_message>
<xml_diff>
--- a/docs/Project Logic XP-Testreferenz.docx
+++ b/docs/Project Logic XP-Testreferenz.docx
@@ -2228,7 +2228,306 @@
         <w:keepNext/>
       </w:pPr>
       <w:r>
-        <w:t>3. Noch geplant – derzeit 0 XP</w:t>
+        <w:t>3. Tages- und Wochenziele</w:t>
+      </w:r>
+    </w:p>
+    <w:p>
+      <w:r>
+        <w:t>Die sichtbaren Ziele wechseln reproduzierbar mit dem Datum beziehungsweise der Kalenderwoche. Ein Ziel kann wegen seiner eindeutigen Kennung nur einmal XP vergeben.</w:t>
+      </w:r>
+    </w:p>
+    <w:tbl>
+      <w:tblPr>
+        <w:tblStyle w:val="TableGrid"/>
+        <w:tblW w:type="dxa" w:w="9360"/>
+        <w:tblLayout w:type="fixed"/>
+        <w:tblLook w:firstColumn="1" w:firstRow="1" w:lastColumn="0" w:lastRow="0" w:noHBand="0" w:noVBand="1" w:val="04A0"/>
+        <w:tblInd w:w="120" w:type="dxa"/>
+      </w:tblPr>
+      <w:tblGrid>
+        <w:gridCol w:w="6840"/>
+        <w:gridCol w:w="2520"/>
+      </w:tblGrid>
+      <w:tr>
+        <w:tc>
+          <w:tcPr>
+            <w:tcW w:type="dxa" w:w="6840"/>
+            <w:vAlign w:val="center"/>
+            <w:tcMar>
+              <w:top w:w="80" w:type="dxa"/>
+              <w:start w:w="120" w:type="dxa"/>
+              <w:bottom w:w="80" w:type="dxa"/>
+              <w:end w:w="120" w:type="dxa"/>
+            </w:tcMar>
+            <w:shd w:fill="E8EEF5"/>
+          </w:tcPr>
+          <w:p>
+            <w:pPr>
+              <w:spacing w:before="0" w:after="40" w:line="276" w:lineRule="auto"/>
+            </w:pPr>
+            <w:r>
+              <w:rPr>
+                <w:rFonts w:ascii="Calibri" w:hAnsi="Calibri"/>
+                <w:b/>
+                <w:color w:val="192423"/>
+                <w:sz w:val="19"/>
+              </w:rPr>
+              <w:t>Abschluss</w:t>
+            </w:r>
+          </w:p>
+        </w:tc>
+        <w:tc>
+          <w:tcPr>
+            <w:tcW w:type="dxa" w:w="2520"/>
+            <w:vAlign w:val="center"/>
+            <w:tcMar>
+              <w:top w:w="80" w:type="dxa"/>
+              <w:start w:w="120" w:type="dxa"/>
+              <w:bottom w:w="80" w:type="dxa"/>
+              <w:end w:w="120" w:type="dxa"/>
+            </w:tcMar>
+            <w:shd w:fill="E8EEF5"/>
+          </w:tcPr>
+          <w:p>
+            <w:pPr>
+              <w:spacing w:before="0" w:after="40" w:line="276" w:lineRule="auto"/>
+            </w:pPr>
+            <w:r>
+              <w:rPr>
+                <w:rFonts w:ascii="Calibri" w:hAnsi="Calibri"/>
+                <w:b/>
+                <w:color w:val="192423"/>
+                <w:sz w:val="19"/>
+              </w:rPr>
+              <w:t>Belohnung</w:t>
+            </w:r>
+          </w:p>
+        </w:tc>
+      </w:tr>
+      <w:tr>
+        <w:tc>
+          <w:tcPr>
+            <w:tcW w:type="dxa" w:w="6840"/>
+            <w:vAlign w:val="center"/>
+            <w:tcMar>
+              <w:top w:w="80" w:type="dxa"/>
+              <w:start w:w="120" w:type="dxa"/>
+              <w:bottom w:w="80" w:type="dxa"/>
+              <w:end w:w="120" w:type="dxa"/>
+            </w:tcMar>
+          </w:tcPr>
+          <w:p>
+            <w:pPr>
+              <w:spacing w:before="0" w:after="40" w:line="276" w:lineRule="auto"/>
+            </w:pPr>
+            <w:r>
+              <w:rPr>
+                <w:rFonts w:ascii="Calibri" w:hAnsi="Calibri"/>
+                <w:b w:val="0"/>
+                <w:color w:val="192423"/>
+                <w:sz w:val="19"/>
+              </w:rPr>
+              <w:t>Ein einzelnes Tagesziel</w:t>
+            </w:r>
+          </w:p>
+        </w:tc>
+        <w:tc>
+          <w:tcPr>
+            <w:tcW w:type="dxa" w:w="2520"/>
+            <w:vAlign w:val="center"/>
+            <w:tcMar>
+              <w:top w:w="80" w:type="dxa"/>
+              <w:start w:w="120" w:type="dxa"/>
+              <w:bottom w:w="80" w:type="dxa"/>
+              <w:end w:w="120" w:type="dxa"/>
+            </w:tcMar>
+          </w:tcPr>
+          <w:p>
+            <w:pPr>
+              <w:spacing w:before="0" w:after="40" w:line="276" w:lineRule="auto"/>
+            </w:pPr>
+            <w:r>
+              <w:rPr>
+                <w:rFonts w:ascii="Calibri" w:hAnsi="Calibri"/>
+                <w:b w:val="0"/>
+                <w:color w:val="192423"/>
+                <w:sz w:val="19"/>
+              </w:rPr>
+              <w:t>5 XP</w:t>
+            </w:r>
+          </w:p>
+        </w:tc>
+      </w:tr>
+      <w:tr>
+        <w:tc>
+          <w:tcPr>
+            <w:tcW w:type="dxa" w:w="6840"/>
+            <w:vAlign w:val="center"/>
+            <w:tcMar>
+              <w:top w:w="80" w:type="dxa"/>
+              <w:start w:w="120" w:type="dxa"/>
+              <w:bottom w:w="80" w:type="dxa"/>
+              <w:end w:w="120" w:type="dxa"/>
+            </w:tcMar>
+          </w:tcPr>
+          <w:p>
+            <w:pPr>
+              <w:spacing w:before="0" w:after="40" w:line="276" w:lineRule="auto"/>
+            </w:pPr>
+            <w:r>
+              <w:rPr>
+                <w:rFonts w:ascii="Calibri" w:hAnsi="Calibri"/>
+                <w:b w:val="0"/>
+                <w:color w:val="192423"/>
+                <w:sz w:val="19"/>
+              </w:rPr>
+              <w:t>Alle drei Tagesziele</w:t>
+            </w:r>
+          </w:p>
+        </w:tc>
+        <w:tc>
+          <w:tcPr>
+            <w:tcW w:type="dxa" w:w="2520"/>
+            <w:vAlign w:val="center"/>
+            <w:tcMar>
+              <w:top w:w="80" w:type="dxa"/>
+              <w:start w:w="120" w:type="dxa"/>
+              <w:bottom w:w="80" w:type="dxa"/>
+              <w:end w:w="120" w:type="dxa"/>
+            </w:tcMar>
+          </w:tcPr>
+          <w:p>
+            <w:pPr>
+              <w:spacing w:before="0" w:after="40" w:line="276" w:lineRule="auto"/>
+            </w:pPr>
+            <w:r>
+              <w:rPr>
+                <w:rFonts w:ascii="Calibri" w:hAnsi="Calibri"/>
+                <w:b w:val="0"/>
+                <w:color w:val="192423"/>
+                <w:sz w:val="19"/>
+              </w:rPr>
+              <w:t>+15 XP Komplettbonus</w:t>
+            </w:r>
+          </w:p>
+        </w:tc>
+      </w:tr>
+      <w:tr>
+        <w:tc>
+          <w:tcPr>
+            <w:tcW w:type="dxa" w:w="6840"/>
+            <w:vAlign w:val="center"/>
+            <w:tcMar>
+              <w:top w:w="80" w:type="dxa"/>
+              <w:start w:w="120" w:type="dxa"/>
+              <w:bottom w:w="80" w:type="dxa"/>
+              <w:end w:w="120" w:type="dxa"/>
+            </w:tcMar>
+          </w:tcPr>
+          <w:p>
+            <w:pPr>
+              <w:spacing w:before="0" w:after="40" w:line="276" w:lineRule="auto"/>
+            </w:pPr>
+            <w:r>
+              <w:rPr>
+                <w:rFonts w:ascii="Calibri" w:hAnsi="Calibri"/>
+                <w:b w:val="0"/>
+                <w:color w:val="192423"/>
+                <w:sz w:val="19"/>
+              </w:rPr>
+              <w:t>Ein einzelnes Wochenziel</w:t>
+            </w:r>
+          </w:p>
+        </w:tc>
+        <w:tc>
+          <w:tcPr>
+            <w:tcW w:type="dxa" w:w="2520"/>
+            <w:vAlign w:val="center"/>
+            <w:tcMar>
+              <w:top w:w="80" w:type="dxa"/>
+              <w:start w:w="120" w:type="dxa"/>
+              <w:bottom w:w="80" w:type="dxa"/>
+              <w:end w:w="120" w:type="dxa"/>
+            </w:tcMar>
+          </w:tcPr>
+          <w:p>
+            <w:pPr>
+              <w:spacing w:before="0" w:after="40" w:line="276" w:lineRule="auto"/>
+            </w:pPr>
+            <w:r>
+              <w:rPr>
+                <w:rFonts w:ascii="Calibri" w:hAnsi="Calibri"/>
+                <w:b w:val="0"/>
+                <w:color w:val="192423"/>
+                <w:sz w:val="19"/>
+              </w:rPr>
+              <w:t>40 XP</w:t>
+            </w:r>
+          </w:p>
+        </w:tc>
+      </w:tr>
+      <w:tr>
+        <w:tc>
+          <w:tcPr>
+            <w:tcW w:type="dxa" w:w="6840"/>
+            <w:vAlign w:val="center"/>
+            <w:tcMar>
+              <w:top w:w="80" w:type="dxa"/>
+              <w:start w:w="120" w:type="dxa"/>
+              <w:bottom w:w="80" w:type="dxa"/>
+              <w:end w:w="120" w:type="dxa"/>
+            </w:tcMar>
+          </w:tcPr>
+          <w:p>
+            <w:pPr>
+              <w:spacing w:before="0" w:after="40" w:line="276" w:lineRule="auto"/>
+            </w:pPr>
+            <w:r>
+              <w:rPr>
+                <w:rFonts w:ascii="Calibri" w:hAnsi="Calibri"/>
+                <w:b w:val="0"/>
+                <w:color w:val="192423"/>
+                <w:sz w:val="19"/>
+              </w:rPr>
+              <w:t>Beide Wochenziele</w:t>
+            </w:r>
+          </w:p>
+        </w:tc>
+        <w:tc>
+          <w:tcPr>
+            <w:tcW w:type="dxa" w:w="2520"/>
+            <w:vAlign w:val="center"/>
+            <w:tcMar>
+              <w:top w:w="80" w:type="dxa"/>
+              <w:start w:w="120" w:type="dxa"/>
+              <w:bottom w:w="80" w:type="dxa"/>
+              <w:end w:w="120" w:type="dxa"/>
+            </w:tcMar>
+          </w:tcPr>
+          <w:p>
+            <w:pPr>
+              <w:spacing w:before="0" w:after="40" w:line="276" w:lineRule="auto"/>
+            </w:pPr>
+            <w:r>
+              <w:rPr>
+                <w:rFonts w:ascii="Calibri" w:hAnsi="Calibri"/>
+                <w:b w:val="0"/>
+                <w:color w:val="192423"/>
+                <w:sz w:val="19"/>
+              </w:rPr>
+              <w:t>+30 XP Komplettbonus</w:t>
+            </w:r>
+          </w:p>
+        </w:tc>
+      </w:tr>
+    </w:tbl>
+    <w:p>
+      <w:pPr>
+        <w:pStyle w:val="Heading2"/>
+        <w:keepNext/>
+      </w:pPr>
+      <w:r>
+        <w:t>Rotation und Testverhalten</w:t>
       </w:r>
     </w:p>
     <w:p>
@@ -2238,7 +2537,46 @@
         <w:ind w:left="540" w:hanging="271"/>
       </w:pPr>
       <w:r>
-        <w:t>Tägliche und wöchentliche Missionen: eigene Abschlussbelohnungen nach dem Balancing-Test.</w:t>
+        <w:t>Heute: Das Tagesrätsel ist immer dabei; zwei weitere Ziele rotieren zwischen Zufallsrätsel, Sammlung, ohne Hinweis und zwei Spielarten.</w:t>
+      </w:r>
+    </w:p>
+    <w:p>
+      <w:pPr>
+        <w:pStyle w:val="ListBullet"/>
+        <w:spacing w:after="80"/>
+        <w:ind w:left="540" w:hanging="271"/>
+      </w:pPr>
+      <w:r>
+        <w:t>Diese Woche: Zwei Ziele rotieren zwischen drei aktiven Tagen, drei Spielarten, fünf Rätseln, drei Lösungen ohne Hinweis und zwei schweren Rätseln.</w:t>
+      </w:r>
+    </w:p>
+    <w:p>
+      <w:pPr>
+        <w:pStyle w:val="ListBullet"/>
+        <w:spacing w:after="80"/>
+        <w:ind w:left="540" w:hanging="271"/>
+      </w:pPr>
+      <w:r>
+        <w:t>Alle Fortschritte werden aus dem Abschlussverlauf der jeweiligen Tages- oder Wochenperiode berechnet; Lebenszeitwerte zählen nicht versehentlich in Wochenziele hinein.</w:t>
+      </w:r>
+    </w:p>
+    <w:p>
+      <w:pPr>
+        <w:pStyle w:val="ListBullet"/>
+        <w:spacing w:after="80"/>
+        <w:ind w:left="540" w:hanging="271"/>
+      </w:pPr>
+      <w:r>
+        <w:t>Im XP-Verlauf erscheinen Einzelziele als Missionsbelohnung und vollständige Zielsets als eigener Komplettbonus.</w:t>
+      </w:r>
+    </w:p>
+    <w:p>
+      <w:pPr>
+        <w:pStyle w:val="Heading1"/>
+        <w:keepNext/>
+      </w:pPr>
+      <w:r>
+        <w:t>4. Noch geplant – derzeit 0 XP</w:t>
       </w:r>
     </w:p>
     <w:p>
@@ -2351,7 +2689,7 @@
         <w:color w:val="52605E"/>
         <w:sz w:val="17"/>
       </w:rPr>
-      <w:t>XP-Balance v2 · Stand 8. August 2026</w:t>
+      <w:t>XP-Balance v3 · Stand 8. August 2026</w:t>
     </w:r>
   </w:p>
 </w:ftr>

</xml_diff>